<commit_message>
disable quarto _freeze and remove execution cache
</commit_message>
<xml_diff>
--- a/docs/module01.docx
+++ b/docs/module01.docx
@@ -662,7 +662,7 @@
                     <a:graphicData uri="http://schemas.openxmlformats.org/drawingml/2006/picture">
                       <pic:pic>
                         <pic:nvPicPr>
-                          <pic:cNvPr descr="C:\Program Files\RStudio\resources\app\bin\quarto\share\formats\docx\warning.png" id="25" name="Picture"/>
+                          <pic:cNvPr descr="C:\PROGRA~1\RStudio\RESOUR~1\app\bin\quarto\share\formats\docx\warning.png" id="25" name="Picture"/>
                           <pic:cNvPicPr>
                             <a:picLocks noChangeArrowheads="1" noChangeAspect="1"/>
                           </pic:cNvPicPr>
@@ -6139,7 +6139,7 @@
                     <a:graphicData uri="http://schemas.openxmlformats.org/drawingml/2006/picture">
                       <pic:pic>
                         <pic:nvPicPr>
-                          <pic:cNvPr descr="C:\Program Files\RStudio\resources\app\bin\quarto\share\formats\docx\note.png" id="36" name="Picture"/>
+                          <pic:cNvPr descr="C:\PROGRA~1\RStudio\RESOUR~1\app\bin\quarto\share\formats\docx\note.png" id="36" name="Picture"/>
                           <pic:cNvPicPr>
                             <a:picLocks noChangeArrowheads="1" noChangeAspect="1"/>
                           </pic:cNvPicPr>

</xml_diff>